<commit_message>
chore: publish goal-setting HSIRB packet for cloud access
Sync revised exempt packet, participant appendices, admin print masters, and rebuild scripts so Cursor Cloud can use the current IRB materials.

Co-authored-by: Cursor <cursoragent@cursor.com>
</commit_message>
<xml_diff>
--- a/apps/studies/assets/irb/goal-setting/materials/consent_form.docx
+++ b/apps/studies/assets/irb/goal-setting/materials/consent_form.docx
@@ -67,7 +67,7 @@
           <w:b/>
           <w:sz w:val="28"/>
         </w:rPr>
-        <w:t>A Study in Decision Making</w:t>
+        <w:t>A Study in Decision Making — Main Study</w:t>
       </w:r>
     </w:p>
     <w:p>
@@ -106,7 +106,7 @@
           <w:rFonts w:ascii="Times New Roman" w:hAnsi="Times New Roman"/>
           <w:sz w:val="24"/>
         </w:rPr>
-        <w:t>You are invited to participate because you are a student enrolled in a participating Business Administration course at Nicholls State University (for example, BSAD courses) or were otherwise invited to take part in this study. If you agree to participate, you will attend an in-person research session in a campus laboratory. During the session, you will complete a decision-making task involving anagram puzzles (word puzzles) in a paper workbook. The purpose of this task is to help us understand how people approach decision-making tasks in work settings. You will first complete brief practice rounds to learn the task, then complete several timed performance rounds under instructions assigned to you at random. You will also be asked to complete brief questionnaires about the task, individual difference measures (including personality traits), and basic demographics. Participation in this study will take no more than 1 hour to complete. Because understanding the full scientific purpose of the study during the session could influence responses, you will receive a brief written appreciation letter at the end of your session; a complete debriefing explaining the study's purpose and findings will be provided after data collection at Nicholls State University is complete.</w:t>
+        <w:t>You are invited to participate because you are a student enrolled in a participating Business Administration course at Nicholls State University (for example, BSAD courses) or were otherwise invited to take part in this study. If you agree to participate, you will attend an in-person research session in a campus classroom or laboratory. During the session, you will complete a decision-making task involving anagram puzzles (word puzzles) in a paper workbook. The purpose of this task is to help us understand how people approach decision-making tasks in work settings. You will first complete brief practice rounds to learn the task, then complete several timed performance rounds under instructions assigned to you at random. You will also be asked to complete brief questionnaires about the task, individual difference measures (including personality traits), and basic demographics. After the timed rounds, while the researcher is out of the room, you will privately check your work and complete an anonymous productivity report (you may use your phone only to access an online Scrabble dictionary via a QR code on that report). Participation in this study will take no more than 1 hour to complete. Because understanding the full scientific purpose of the study during the session could influence responses, you will receive a brief written appreciation letter at the end of your session; a complete debriefing explaining the study's purpose and findings will be provided after data collection at Nicholls State University is complete.</w:t>
       </w:r>
     </w:p>
     <w:p>
@@ -236,7 +236,33 @@
           <w:rFonts w:ascii="Times New Roman" w:hAnsi="Times New Roman"/>
           <w:sz w:val="24"/>
         </w:rPr>
-        <w:t>For participating in this study, you will receive $7.00 with an opportunity to receive more cash during the study. Payment is handled during the session: you will receive a cash envelope and, at a private point in the study, determine how much you keep based on instructions given to you. Any unearned cash is returned anonymously while the researcher is out of the room.</w:t>
+        <w:t>In appreciation of your participation, you will receive a small cash reward of at least $7.00, with an opportunity to receive up to $14.00 total depending on the instructions assigned to you during the session and your performance on the anagram task.</w:t>
+      </w:r>
+    </w:p>
+    <w:p>
+      <w:pPr>
+        <w:spacing w:lineRule="auto" w:line="360" w:after="280" w:before="0"/>
+        <w:jc w:val="both"/>
+      </w:pPr>
+      <w:r>
+        <w:rPr>
+          <w:rFonts w:ascii="Times New Roman" w:hAnsi="Times New Roman"/>
+          <w:sz w:val="24"/>
+        </w:rPr>
+        <w:t>At your workstation you will find a sealed cash envelope containing $14.00 in one-dollar bills. After you complete the timed anagram rounds and brief questionnaires, the researcher will leave the room so you can work privately. You will check your work, complete an anonymous productivity report for the seven scored rounds (round eight does not count toward payment), and take from the cash envelope only the amount specified on that report for your assigned instructions. Place any unearned cash back in the cash envelope, seal the cash envelope and productivity report together in the large envelope provided, and deposit your materials as directed. The research team cannot verify your self-reported performance or link the amount you keep to your identity.</w:t>
+      </w:r>
+    </w:p>
+    <w:p>
+      <w:pPr>
+        <w:spacing w:lineRule="auto" w:line="360" w:after="280" w:before="0"/>
+        <w:jc w:val="both"/>
+      </w:pPr>
+      <w:r>
+        <w:rPr>
+          <w:rFonts w:ascii="Times New Roman" w:hAnsi="Times New Roman"/>
+          <w:sz w:val="24"/>
+        </w:rPr>
+        <w:t>Because payment details depend on your randomly assigned instructions, the specific amount you may keep is stated on your productivity report during the session, not on this consent form.</w:t>
       </w:r>
     </w:p>
     <w:p>
@@ -301,7 +327,7 @@
           <w:rFonts w:ascii="Times New Roman" w:hAnsi="Times New Roman"/>
           <w:sz w:val="24"/>
         </w:rPr>
-        <w:t>Your participation in this study is voluntary. You may decide not to participate or to withdraw from this study at any time by advising the researcher and may do so without penalty or loss of remuneration. If you withdraw from the study before data collection is completed, you will receive your remuneration, but your data will be destroyed. You have the right to skip any question(s)/procedure(s) you choose.</w:t>
+        <w:t>Your participation in this study is voluntary. You may decide not to participate or to withdraw from this study at any time by advising the researcher and may do so without penalty. If you withdraw before the private self-payment step, you will receive $7.00 for your time and your data will be destroyed. If you withdraw after that step, you may keep any cash you already took per the productivity report instructions, but your data will be destroyed. You have the right to skip any question(s)/procedure(s) you choose.</w:t>
       </w:r>
     </w:p>
     <w:p>
@@ -315,6 +341,19 @@
           <w:sz w:val="24"/>
         </w:rPr>
         <w:t>Once you have completed the study, you can no longer withdraw your data, as the data will not be identifiable.</w:t>
+      </w:r>
+    </w:p>
+    <w:p>
+      <w:pPr>
+        <w:spacing w:lineRule="auto" w:line="360" w:after="280" w:before="0"/>
+        <w:jc w:val="both"/>
+      </w:pPr>
+      <w:r>
+        <w:rPr>
+          <w:rFonts w:ascii="Times New Roman" w:hAnsi="Times New Roman"/>
+          <w:sz w:val="24"/>
+        </w:rPr>
+        <w:t>Students who participated in the pilot session may also participate in the main study. Because all data are anonymous, the research team cannot monitor whether the same individual participates in both phases without compromising anonymity.</w:t>
       </w:r>
     </w:p>
     <w:p>

</xml_diff>